<commit_message>
Complète l'inventaire avec les balles vertes et oranges
3 paniers de 60 balles vertes et 2 paniers de 60 balles oranges
s'ajoutent aux 3 seaux de balles rouges : 420 balles de mini-tennis,
900 balles au total sur la saison.

Co-Authored-By: Claude Opus 5 <noreply@anthropic.com>
Claude-Session: https://claude.ai/code/session_01RsDkbcD3KwyPviDTcs72WZ
</commit_message>
<xml_diff>
--- a/Inventaire_des_balles_2026-2027.docx
+++ b/Inventaire_des_balles_2026-2027.docx
@@ -1412,7 +1412,7 @@
           <w:sz w:val="23"/>
           <w:szCs w:val="23"/>
         </w:rPr>
-        <w:t xml:space="preserve">Balles rouges — seaux communs</w:t>
+        <w:t xml:space="preserve">Balles rouges, oranges et vertes — contenants communs</w:t>
       </w:r>
     </w:p>
     <w:tbl>
@@ -1464,7 +1464,7 @@
                 <w:sz w:val="17"/>
                 <w:szCs w:val="17"/>
               </w:rPr>
-              <w:t xml:space="preserve">Seau</w:t>
+              <w:t xml:space="preserve">Qté</w:t>
             </w:r>
           </w:p>
         </w:tc>
@@ -1494,7 +1494,7 @@
                 <w:sz w:val="17"/>
                 <w:szCs w:val="17"/>
               </w:rPr>
-              <w:t xml:space="preserve">Attribution</w:t>
+              <w:t xml:space="preserve">Contenant</w:t>
             </w:r>
           </w:p>
         </w:tc>
@@ -1590,7 +1590,7 @@
                 <w:sz w:val="19"/>
                 <w:szCs w:val="19"/>
               </w:rPr>
-              <w:t xml:space="preserve">1</w:t>
+              <w:t xml:space="preserve">3</w:t>
             </w:r>
           </w:p>
         </w:tc>
@@ -1619,7 +1619,7 @@
                 <w:sz w:val="19"/>
                 <w:szCs w:val="19"/>
               </w:rPr>
-              <w:t xml:space="preserve">Seau commun</w:t>
+              <w:t xml:space="preserve">Seaux de 40 balles</w:t>
             </w:r>
           </w:p>
         </w:tc>
@@ -1678,7 +1678,7 @@
                 <w:sz w:val="19"/>
                 <w:szCs w:val="19"/>
               </w:rPr>
-              <w:t xml:space="preserve">40</w:t>
+              <w:t xml:space="preserve">120</w:t>
             </w:r>
           </w:p>
         </w:tc>
@@ -1743,7 +1743,7 @@
                 <w:sz w:val="19"/>
                 <w:szCs w:val="19"/>
               </w:rPr>
-              <w:t xml:space="preserve">Seau commun</w:t>
+              <w:t xml:space="preserve">Paniers de 60 balles</w:t>
             </w:r>
           </w:p>
         </w:tc>
@@ -1772,7 +1772,7 @@
                 <w:sz w:val="19"/>
                 <w:szCs w:val="19"/>
               </w:rPr>
-              <w:t xml:space="preserve">Balles rouges</w:t>
+              <w:t xml:space="preserve">Balles oranges</w:t>
             </w:r>
           </w:p>
         </w:tc>
@@ -1802,7 +1802,7 @@
                 <w:sz w:val="19"/>
                 <w:szCs w:val="19"/>
               </w:rPr>
-              <w:t xml:space="preserve">40</w:t>
+              <w:t xml:space="preserve">120</w:t>
             </w:r>
           </w:p>
         </w:tc>
@@ -1867,7 +1867,7 @@
                 <w:sz w:val="19"/>
                 <w:szCs w:val="19"/>
               </w:rPr>
-              <w:t xml:space="preserve">Seau commun</w:t>
+              <w:t xml:space="preserve">Paniers de 60 balles</w:t>
             </w:r>
           </w:p>
         </w:tc>
@@ -1896,7 +1896,7 @@
                 <w:sz w:val="19"/>
                 <w:szCs w:val="19"/>
               </w:rPr>
-              <w:t xml:space="preserve">Balles rouges</w:t>
+              <w:t xml:space="preserve">Balles vertes</w:t>
             </w:r>
           </w:p>
         </w:tc>
@@ -1926,7 +1926,7 @@
                 <w:sz w:val="19"/>
                 <w:szCs w:val="19"/>
               </w:rPr>
-              <w:t xml:space="preserve">40</w:t>
+              <w:t xml:space="preserve">180</w:t>
             </w:r>
           </w:p>
         </w:tc>
@@ -1962,7 +1962,7 @@
                 <w:sz w:val="19"/>
                 <w:szCs w:val="19"/>
               </w:rPr>
-              <w:t xml:space="preserve">Total balles rouges — 3 seaux</w:t>
+              <w:t xml:space="preserve">Total balles rouges, oranges et vertes — 8 contenants</w:t>
             </w:r>
           </w:p>
         </w:tc>
@@ -1992,7 +1992,7 @@
                 <w:sz w:val="19"/>
                 <w:szCs w:val="19"/>
               </w:rPr>
-              <w:t xml:space="preserve">120</w:t>
+              <w:t xml:space="preserve">420</w:t>
             </w:r>
           </w:p>
         </w:tc>
@@ -2009,7 +2009,7 @@
           <w:sz w:val="17"/>
           <w:szCs w:val="17"/>
         </w:rPr>
-        <w:t xml:space="preserve">Pas de seau individuel : tous les moniteurs puisent dans les mêmes seaux. Les balles oranges et vertes ne sont pas encore inventoriées.</w:t>
+        <w:t xml:space="preserve">Pas de contenant individuel pour ces balles : tous les moniteurs puisent dans les mêmes paniers et seaux. Le manquant est réparti entre les moniteurs au prorata de l’utilisation.</w:t>
       </w:r>
     </w:p>
     <w:p>
@@ -2327,7 +2327,7 @@
                 <w:sz w:val="19"/>
                 <w:szCs w:val="19"/>
               </w:rPr>
-              <w:t xml:space="preserve">3</w:t>
+              <w:t xml:space="preserve">8</w:t>
             </w:r>
           </w:p>
         </w:tc>
@@ -2356,7 +2356,7 @@
                 <w:sz w:val="19"/>
                 <w:szCs w:val="19"/>
               </w:rPr>
-              <w:t xml:space="preserve">seaux de 40</w:t>
+              <w:t xml:space="preserve">paniers et seaux</w:t>
             </w:r>
           </w:p>
         </w:tc>
@@ -2385,7 +2385,7 @@
                 <w:sz w:val="19"/>
                 <w:szCs w:val="19"/>
               </w:rPr>
-              <w:t xml:space="preserve">Balles rouges</w:t>
+              <w:t xml:space="preserve">Rouges, oranges, vertes</w:t>
             </w:r>
           </w:p>
         </w:tc>
@@ -2415,7 +2415,7 @@
                 <w:sz w:val="19"/>
                 <w:szCs w:val="19"/>
               </w:rPr>
-              <w:t xml:space="preserve">120</w:t>
+              <w:t xml:space="preserve">420</w:t>
             </w:r>
           </w:p>
         </w:tc>
@@ -2481,7 +2481,7 @@
                 <w:sz w:val="19"/>
                 <w:szCs w:val="19"/>
               </w:rPr>
-              <w:t xml:space="preserve">600</w:t>
+              <w:t xml:space="preserve">900</w:t>
             </w:r>
           </w:p>
         </w:tc>
@@ -2509,7 +2509,7 @@
           <w:sz w:val="18"/>
           <w:szCs w:val="18"/>
         </w:rPr>
-        <w:t xml:space="preserve">480 balles dures à 1,95 € = </w:t>
+        <w:t xml:space="preserve">balles dures </w:t>
       </w:r>
       <w:r>
         <w:rPr>
@@ -2529,7 +2529,7 @@
           <w:sz w:val="18"/>
           <w:szCs w:val="18"/>
         </w:rPr>
-        <w:t xml:space="preserve">   ·   120 balles rouges à 1 € = </w:t>
+        <w:t xml:space="preserve">   ·   rouges, oranges et vertes </w:t>
       </w:r>
       <w:r>
         <w:rPr>
@@ -2540,7 +2540,21 @@
           <w:sz w:val="18"/>
           <w:szCs w:val="18"/>
         </w:rPr>
-        <w:t xml:space="preserve">120 €</w:t>
+        <w:t xml:space="preserve">420 €</w:t>
+      </w:r>
+    </w:p>
+    <w:p>
+      <w:pPr>
+        <w:spacing w:after="0" w:before="30" w:line="230"/>
+      </w:pPr>
+      <w:r>
+        <w:rPr>
+          <w:rFonts w:ascii="Calibri" w:cs="Calibri" w:eastAsia="Calibri" w:hAnsi="Calibri"/>
+          <w:color w:val="6E6E6E"/>
+          <w:sz w:val="17"/>
+          <w:szCs w:val="17"/>
+        </w:rPr>
+        <w:t xml:space="preserve">Calculée au prix coûtant : 1,95 € la balle dure, 1 € la balle rouge, orange ou verte.</w:t>
       </w:r>
     </w:p>
     <w:p>

</xml_diff>